<commit_message>
bibliography update and literature review
</commit_message>
<xml_diff>
--- a/04_notes/literature/lit_notes_survey_experiment.docx
+++ b/04_notes/literature/lit_notes_survey_experiment.docx
@@ -9,30 +9,18 @@
           <w:bCs/>
           <w:sz w:val="40"/>
           <w:szCs w:val="40"/>
-          <w:lang w:val="de-DE"/>
-        </w:rPr>
-      </w:pPr>
-      <w:proofErr w:type="spellStart"/>
+          <w:lang w:val="en-GB"/>
+        </w:rPr>
+      </w:pPr>
       <w:r>
         <w:rPr>
           <w:b/>
           <w:bCs/>
           <w:sz w:val="40"/>
           <w:szCs w:val="40"/>
-          <w:lang w:val="de-DE"/>
-        </w:rPr>
-        <w:t>Literature</w:t>
-      </w:r>
-      <w:proofErr w:type="spellEnd"/>
-      <w:r>
-        <w:rPr>
-          <w:b/>
-          <w:bCs/>
-          <w:sz w:val="40"/>
-          <w:szCs w:val="40"/>
-          <w:lang w:val="de-DE"/>
-        </w:rPr>
-        <w:t xml:space="preserve"> Review: Survey Experiments</w:t>
+          <w:lang w:val="en-GB"/>
+        </w:rPr>
+        <w:t>Literature Review: Survey Experiments</w:t>
       </w:r>
     </w:p>
     <w:p>
@@ -669,6 +657,68 @@
           <w:lang w:val="en-GB"/>
         </w:rPr>
         <w:t>Discussion:</w:t>
+      </w:r>
+    </w:p>
+    <w:p>
+      <w:pPr>
+        <w:jc w:val="both"/>
+        <w:rPr>
+          <w:b/>
+          <w:bCs/>
+          <w:lang w:val="en-GB"/>
+        </w:rPr>
+      </w:pPr>
+    </w:p>
+    <w:p>
+      <w:pPr>
+        <w:jc w:val="both"/>
+        <w:rPr>
+          <w:b/>
+          <w:bCs/>
+          <w:lang w:val="en-GB"/>
+        </w:rPr>
+      </w:pPr>
+    </w:p>
+    <w:p>
+      <w:pPr>
+        <w:jc w:val="both"/>
+        <w:rPr>
+          <w:lang w:val="en-GB"/>
+        </w:rPr>
+      </w:pPr>
+      <w:r>
+        <w:rPr>
+          <w:lang w:val="en-GB"/>
+        </w:rPr>
+        <w:t xml:space="preserve">Why </w:t>
+      </w:r>
+      <w:proofErr w:type="gramStart"/>
+      <w:r>
+        <w:rPr>
+          <w:lang w:val="en-GB"/>
+        </w:rPr>
+        <w:t>do</w:t>
+      </w:r>
+      <w:proofErr w:type="gramEnd"/>
+      <w:r>
+        <w:rPr>
+          <w:lang w:val="en-GB"/>
+        </w:rPr>
+        <w:t xml:space="preserve"> citizen support repressive anti-crime policies? </w:t>
+      </w:r>
+    </w:p>
+    <w:p>
+      <w:pPr>
+        <w:jc w:val="both"/>
+        <w:rPr>
+          <w:lang w:val="en-GB"/>
+        </w:rPr>
+      </w:pPr>
+      <w:r>
+        <w:rPr>
+          <w:lang w:val="en-GB"/>
+        </w:rPr>
+        <w:t>Does target framing affect t</w:t>
       </w:r>
     </w:p>
     <w:sectPr>

</xml_diff>